<commit_message>
updates for new model
</commit_message>
<xml_diff>
--- a/docs/Techanical Details.docx
+++ b/docs/Techanical Details.docx
@@ -18,7 +18,6 @@
           <w:lang w:bidi="si-LK"/>
         </w:rPr>
       </w:pPr>
-      <w:bookmarkStart w:id="0" w:name="_GoBack"/>
       <w:r>
         <w:rPr>
           <w:rFonts w:ascii="Segoe UI" w:eastAsia="Times New Roman" w:hAnsi="Segoe UI" w:cs="Segoe UI"/>
@@ -33,7 +32,6 @@
         <w:t>TECHNICAL REFERENCE DOCUMENT</w:t>
       </w:r>
     </w:p>
-    <w:bookmarkEnd w:id="0"/>
     <w:p>
       <w:pPr>
         <w:shd w:val="clear" w:color="auto" w:fill="FFFFFF"/>
@@ -6151,7 +6149,15 @@
     </w:p>
     <w:tbl>
       <w:tblPr>
-        <w:tblW w:w="11280" w:type="dxa"/>
+        <w:tblW w:w="0" w:type="auto"/>
+        <w:tblBorders>
+          <w:top w:val="single" w:sz="4" w:space="0" w:color="auto"/>
+          <w:left w:val="single" w:sz="4" w:space="0" w:color="auto"/>
+          <w:bottom w:val="single" w:sz="4" w:space="0" w:color="auto"/>
+          <w:right w:val="single" w:sz="4" w:space="0" w:color="auto"/>
+          <w:insideH w:val="single" w:sz="4" w:space="0" w:color="auto"/>
+          <w:insideV w:val="single" w:sz="4" w:space="0" w:color="auto"/>
+        </w:tblBorders>
         <w:tblCellMar>
           <w:top w:w="15" w:type="dxa"/>
           <w:left w:w="15" w:type="dxa"/>
@@ -6161,124 +6167,15 @@
         <w:tblLook w:val="04A0" w:firstRow="1" w:lastRow="0" w:firstColumn="1" w:lastColumn="0" w:noHBand="0" w:noVBand="1"/>
       </w:tblPr>
       <w:tblGrid>
-        <w:gridCol w:w="4337"/>
-        <w:gridCol w:w="2424"/>
-        <w:gridCol w:w="4519"/>
+        <w:gridCol w:w="2440"/>
+        <w:gridCol w:w="1726"/>
+        <w:gridCol w:w="4623"/>
       </w:tblGrid>
       <w:tr>
         <w:trPr>
+          <w:trHeight w:val="170"/>
           <w:tblHeader/>
         </w:trPr>
-        <w:tc>
-          <w:tcPr>
-            <w:tcW w:w="0" w:type="auto"/>
-            <w:tcBorders>
-              <w:top w:val="nil"/>
-            </w:tcBorders>
-            <w:tcMar>
-              <w:top w:w="150" w:type="dxa"/>
-              <w:left w:w="0" w:type="dxa"/>
-              <w:bottom w:w="150" w:type="dxa"/>
-              <w:right w:w="240" w:type="dxa"/>
-            </w:tcMar>
-            <w:vAlign w:val="center"/>
-            <w:hideMark/>
-          </w:tcPr>
-          <w:p>
-            <w:pPr>
-              <w:spacing w:after="0" w:line="375" w:lineRule="atLeast"/>
-              <w:rPr>
-                <w:rFonts w:ascii="Segoe UI" w:eastAsia="Times New Roman" w:hAnsi="Segoe UI" w:cs="Segoe UI"/>
-                <w:sz w:val="23"/>
-                <w:szCs w:val="23"/>
-                <w:lang w:bidi="si-LK"/>
-              </w:rPr>
-            </w:pPr>
-            <w:r>
-              <w:rPr>
-                <w:rFonts w:ascii="Segoe UI" w:eastAsia="Times New Roman" w:hAnsi="Segoe UI" w:cs="Segoe UI"/>
-                <w:sz w:val="23"/>
-                <w:szCs w:val="23"/>
-                <w:lang w:bidi="si-LK"/>
-              </w:rPr>
-              <w:t>Feature</w:t>
-            </w:r>
-          </w:p>
-        </w:tc>
-        <w:tc>
-          <w:tcPr>
-            <w:tcW w:w="0" w:type="auto"/>
-            <w:tcBorders>
-              <w:top w:val="nil"/>
-            </w:tcBorders>
-            <w:tcMar>
-              <w:top w:w="150" w:type="dxa"/>
-              <w:left w:w="240" w:type="dxa"/>
-              <w:bottom w:w="150" w:type="dxa"/>
-              <w:right w:w="240" w:type="dxa"/>
-            </w:tcMar>
-            <w:vAlign w:val="center"/>
-            <w:hideMark/>
-          </w:tcPr>
-          <w:p>
-            <w:pPr>
-              <w:spacing w:after="0" w:line="375" w:lineRule="atLeast"/>
-              <w:rPr>
-                <w:rFonts w:ascii="Segoe UI" w:eastAsia="Times New Roman" w:hAnsi="Segoe UI" w:cs="Segoe UI"/>
-                <w:sz w:val="23"/>
-                <w:szCs w:val="23"/>
-                <w:lang w:bidi="si-LK"/>
-              </w:rPr>
-            </w:pPr>
-            <w:r>
-              <w:rPr>
-                <w:rFonts w:ascii="Segoe UI" w:eastAsia="Times New Roman" w:hAnsi="Segoe UI" w:cs="Segoe UI"/>
-                <w:sz w:val="23"/>
-                <w:szCs w:val="23"/>
-                <w:lang w:bidi="si-LK"/>
-              </w:rPr>
-              <w:t>Importance</w:t>
-            </w:r>
-          </w:p>
-        </w:tc>
-        <w:tc>
-          <w:tcPr>
-            <w:tcW w:w="0" w:type="auto"/>
-            <w:tcBorders>
-              <w:top w:val="nil"/>
-            </w:tcBorders>
-            <w:tcMar>
-              <w:top w:w="150" w:type="dxa"/>
-              <w:left w:w="240" w:type="dxa"/>
-              <w:bottom w:w="150" w:type="dxa"/>
-              <w:right w:w="240" w:type="dxa"/>
-            </w:tcMar>
-            <w:vAlign w:val="center"/>
-            <w:hideMark/>
-          </w:tcPr>
-          <w:p>
-            <w:pPr>
-              <w:spacing w:after="0" w:line="375" w:lineRule="atLeast"/>
-              <w:rPr>
-                <w:rFonts w:ascii="Segoe UI" w:eastAsia="Times New Roman" w:hAnsi="Segoe UI" w:cs="Segoe UI"/>
-                <w:sz w:val="23"/>
-                <w:szCs w:val="23"/>
-                <w:lang w:bidi="si-LK"/>
-              </w:rPr>
-            </w:pPr>
-            <w:r>
-              <w:rPr>
-                <w:rFonts w:ascii="Segoe UI" w:eastAsia="Times New Roman" w:hAnsi="Segoe UI" w:cs="Segoe UI"/>
-                <w:sz w:val="23"/>
-                <w:szCs w:val="23"/>
-                <w:lang w:bidi="si-LK"/>
-              </w:rPr>
-              <w:t>Insight</w:t>
-            </w:r>
-          </w:p>
-        </w:tc>
-      </w:tr>
-      <w:tr>
         <w:tc>
           <w:tcPr>
             <w:tcW w:w="0" w:type="auto"/>
@@ -6294,21 +6191,24 @@
           <w:p>
             <w:pPr>
               <w:spacing w:after="0" w:line="375" w:lineRule="atLeast"/>
-              <w:rPr>
-                <w:rFonts w:ascii="Segoe UI" w:eastAsia="Times New Roman" w:hAnsi="Segoe UI" w:cs="Segoe UI"/>
-                <w:sz w:val="23"/>
-                <w:szCs w:val="23"/>
-                <w:lang w:bidi="si-LK"/>
+              <w:jc w:val="center"/>
+              <w:rPr>
+                <w:rFonts w:ascii="Segoe UI" w:hAnsi="Segoe UI" w:cs="Segoe UI"/>
+                <w:b/>
+                <w:bCs/>
+                <w:sz w:val="23"/>
+                <w:szCs w:val="23"/>
               </w:rPr>
             </w:pPr>
             <w:r>
               <w:rPr>
-                <w:rFonts w:ascii="Segoe UI" w:eastAsia="Times New Roman" w:hAnsi="Segoe UI" w:cs="Segoe UI"/>
-                <w:sz w:val="23"/>
-                <w:szCs w:val="23"/>
-                <w:lang w:bidi="si-LK"/>
-              </w:rPr>
-              <w:t>dns_latency_ms_rolling5</w:t>
+                <w:rFonts w:ascii="Segoe UI" w:hAnsi="Segoe UI" w:cs="Segoe UI"/>
+                <w:b/>
+                <w:bCs/>
+                <w:sz w:val="23"/>
+                <w:szCs w:val="23"/>
+              </w:rPr>
+              <w:t>Feature</w:t>
             </w:r>
           </w:p>
         </w:tc>
@@ -6327,21 +6227,128 @@
           <w:p>
             <w:pPr>
               <w:spacing w:after="0" w:line="375" w:lineRule="atLeast"/>
-              <w:rPr>
-                <w:rFonts w:ascii="Segoe UI" w:eastAsia="Times New Roman" w:hAnsi="Segoe UI" w:cs="Segoe UI"/>
-                <w:sz w:val="23"/>
-                <w:szCs w:val="23"/>
-                <w:lang w:bidi="si-LK"/>
+              <w:jc w:val="center"/>
+              <w:rPr>
+                <w:rFonts w:ascii="Segoe UI" w:hAnsi="Segoe UI" w:cs="Segoe UI"/>
+                <w:b/>
+                <w:bCs/>
+                <w:sz w:val="23"/>
+                <w:szCs w:val="23"/>
               </w:rPr>
             </w:pPr>
             <w:r>
               <w:rPr>
-                <w:rFonts w:ascii="Segoe UI" w:eastAsia="Times New Roman" w:hAnsi="Segoe UI" w:cs="Segoe UI"/>
-                <w:sz w:val="23"/>
-                <w:szCs w:val="23"/>
-                <w:lang w:bidi="si-LK"/>
-              </w:rPr>
-              <w:t>54.2%</w:t>
+                <w:rFonts w:ascii="Segoe UI" w:hAnsi="Segoe UI" w:cs="Segoe UI"/>
+                <w:b/>
+                <w:bCs/>
+                <w:sz w:val="23"/>
+                <w:szCs w:val="23"/>
+              </w:rPr>
+              <w:t>Importance</w:t>
+            </w:r>
+          </w:p>
+        </w:tc>
+        <w:tc>
+          <w:tcPr>
+            <w:tcW w:w="0" w:type="auto"/>
+            <w:tcMar>
+              <w:top w:w="150" w:type="dxa"/>
+              <w:left w:w="240" w:type="dxa"/>
+              <w:bottom w:w="150" w:type="dxa"/>
+              <w:right w:w="240" w:type="dxa"/>
+            </w:tcMar>
+            <w:vAlign w:val="center"/>
+            <w:hideMark/>
+          </w:tcPr>
+          <w:p>
+            <w:pPr>
+              <w:spacing w:after="0" w:line="375" w:lineRule="atLeast"/>
+              <w:jc w:val="center"/>
+              <w:rPr>
+                <w:rFonts w:ascii="Segoe UI" w:hAnsi="Segoe UI" w:cs="Segoe UI"/>
+                <w:b/>
+                <w:bCs/>
+                <w:sz w:val="23"/>
+                <w:szCs w:val="23"/>
+              </w:rPr>
+            </w:pPr>
+            <w:r>
+              <w:rPr>
+                <w:rFonts w:ascii="Segoe UI" w:hAnsi="Segoe UI" w:cs="Segoe UI"/>
+                <w:b/>
+                <w:bCs/>
+                <w:sz w:val="23"/>
+                <w:szCs w:val="23"/>
+              </w:rPr>
+              <w:t>Interpretation</w:t>
+            </w:r>
+          </w:p>
+        </w:tc>
+      </w:tr>
+      <w:tr>
+        <w:trPr>
+          <w:trHeight w:val="170"/>
+        </w:trPr>
+        <w:tc>
+          <w:tcPr>
+            <w:tcW w:w="0" w:type="auto"/>
+            <w:tcMar>
+              <w:top w:w="150" w:type="dxa"/>
+              <w:left w:w="0" w:type="dxa"/>
+              <w:bottom w:w="150" w:type="dxa"/>
+              <w:right w:w="240" w:type="dxa"/>
+            </w:tcMar>
+            <w:vAlign w:val="center"/>
+            <w:hideMark/>
+          </w:tcPr>
+          <w:p>
+            <w:pPr>
+              <w:spacing w:after="0" w:line="375" w:lineRule="atLeast"/>
+              <w:rPr>
+                <w:rFonts w:ascii="Segoe UI" w:hAnsi="Segoe UI" w:cs="Segoe UI"/>
+                <w:sz w:val="23"/>
+                <w:szCs w:val="23"/>
+              </w:rPr>
+            </w:pPr>
+            <w:r>
+              <w:rPr>
+                <w:rStyle w:val="Strong"/>
+                <w:rFonts w:ascii="Segoe UI" w:hAnsi="Segoe UI" w:cs="Segoe UI"/>
+                <w:sz w:val="23"/>
+                <w:szCs w:val="23"/>
+              </w:rPr>
+              <w:t>dns_ping_rolling5</w:t>
+            </w:r>
+          </w:p>
+        </w:tc>
+        <w:tc>
+          <w:tcPr>
+            <w:tcW w:w="0" w:type="auto"/>
+            <w:tcMar>
+              <w:top w:w="150" w:type="dxa"/>
+              <w:left w:w="240" w:type="dxa"/>
+              <w:bottom w:w="150" w:type="dxa"/>
+              <w:right w:w="240" w:type="dxa"/>
+            </w:tcMar>
+            <w:vAlign w:val="center"/>
+            <w:hideMark/>
+          </w:tcPr>
+          <w:p>
+            <w:pPr>
+              <w:spacing w:after="0" w:line="375" w:lineRule="atLeast"/>
+              <w:rPr>
+                <w:rFonts w:ascii="Segoe UI" w:hAnsi="Segoe UI" w:cs="Segoe UI"/>
+                <w:sz w:val="23"/>
+                <w:szCs w:val="23"/>
+              </w:rPr>
+            </w:pPr>
+            <w:r>
+              <w:rPr>
+                <w:rFonts w:ascii="Segoe UI" w:hAnsi="Segoe UI" w:cs="Segoe UI"/>
+                <w:sz w:val="23"/>
+                <w:szCs w:val="23"/>
+              </w:rPr>
+              <w:t>45.2%</w:t>
             </w:r>
           </w:p>
         </w:tc>
@@ -6361,25 +6368,26 @@
             <w:pPr>
               <w:spacing w:after="0" w:line="375" w:lineRule="atLeast"/>
               <w:rPr>
-                <w:rFonts w:ascii="Segoe UI" w:eastAsia="Times New Roman" w:hAnsi="Segoe UI" w:cs="Segoe UI"/>
-                <w:sz w:val="23"/>
-                <w:szCs w:val="23"/>
-                <w:lang w:bidi="si-LK"/>
+                <w:rFonts w:ascii="Segoe UI" w:hAnsi="Segoe UI" w:cs="Segoe UI"/>
+                <w:sz w:val="23"/>
+                <w:szCs w:val="23"/>
               </w:rPr>
             </w:pPr>
             <w:r>
               <w:rPr>
-                <w:rFonts w:ascii="Segoe UI" w:eastAsia="Times New Roman" w:hAnsi="Segoe UI" w:cs="Segoe UI"/>
-                <w:sz w:val="23"/>
-                <w:szCs w:val="23"/>
-                <w:lang w:bidi="si-LK"/>
-              </w:rPr>
-              <w:t>DNS trend most predictive</w:t>
+                <w:rFonts w:ascii="Segoe UI" w:hAnsi="Segoe UI" w:cs="Segoe UI"/>
+                <w:sz w:val="23"/>
+                <w:szCs w:val="23"/>
+              </w:rPr>
+              <w:t>DNS trend most predictive (internet health)</w:t>
             </w:r>
           </w:p>
         </w:tc>
       </w:tr>
       <w:tr>
+        <w:trPr>
+          <w:trHeight w:val="170"/>
+        </w:trPr>
         <w:tc>
           <w:tcPr>
             <w:tcW w:w="0" w:type="auto"/>
@@ -6396,21 +6404,20 @@
             <w:pPr>
               <w:spacing w:after="0" w:line="375" w:lineRule="atLeast"/>
               <w:rPr>
-                <w:rFonts w:ascii="Segoe UI" w:eastAsia="Times New Roman" w:hAnsi="Segoe UI" w:cs="Segoe UI"/>
-                <w:sz w:val="23"/>
-                <w:szCs w:val="23"/>
-                <w:lang w:bidi="si-LK"/>
+                <w:rFonts w:ascii="Segoe UI" w:hAnsi="Segoe UI" w:cs="Segoe UI"/>
+                <w:sz w:val="23"/>
+                <w:szCs w:val="23"/>
               </w:rPr>
             </w:pPr>
             <w:proofErr w:type="spellStart"/>
             <w:r>
               <w:rPr>
-                <w:rFonts w:ascii="Segoe UI" w:eastAsia="Times New Roman" w:hAnsi="Segoe UI" w:cs="Segoe UI"/>
-                <w:sz w:val="23"/>
-                <w:szCs w:val="23"/>
-                <w:lang w:bidi="si-LK"/>
-              </w:rPr>
-              <w:t>dns_latency_trend</w:t>
+                <w:rStyle w:val="Strong"/>
+                <w:rFonts w:ascii="Segoe UI" w:hAnsi="Segoe UI" w:cs="Segoe UI"/>
+                <w:sz w:val="23"/>
+                <w:szCs w:val="23"/>
+              </w:rPr>
+              <w:t>dns_ping_ms</w:t>
             </w:r>
             <w:proofErr w:type="spellEnd"/>
           </w:p>
@@ -6431,20 +6438,18 @@
             <w:pPr>
               <w:spacing w:after="0" w:line="375" w:lineRule="atLeast"/>
               <w:rPr>
-                <w:rFonts w:ascii="Segoe UI" w:eastAsia="Times New Roman" w:hAnsi="Segoe UI" w:cs="Segoe UI"/>
-                <w:sz w:val="23"/>
-                <w:szCs w:val="23"/>
-                <w:lang w:bidi="si-LK"/>
+                <w:rFonts w:ascii="Segoe UI" w:hAnsi="Segoe UI" w:cs="Segoe UI"/>
+                <w:sz w:val="23"/>
+                <w:szCs w:val="23"/>
               </w:rPr>
             </w:pPr>
             <w:r>
               <w:rPr>
-                <w:rFonts w:ascii="Segoe UI" w:eastAsia="Times New Roman" w:hAnsi="Segoe UI" w:cs="Segoe UI"/>
-                <w:sz w:val="23"/>
-                <w:szCs w:val="23"/>
-                <w:lang w:bidi="si-LK"/>
-              </w:rPr>
-              <w:t>10.0%</w:t>
+                <w:rFonts w:ascii="Segoe UI" w:hAnsi="Segoe UI" w:cs="Segoe UI"/>
+                <w:sz w:val="23"/>
+                <w:szCs w:val="23"/>
+              </w:rPr>
+              <w:t>28.1%</w:t>
             </w:r>
           </w:p>
         </w:tc>
@@ -6464,25 +6469,26 @@
             <w:pPr>
               <w:spacing w:after="0" w:line="375" w:lineRule="atLeast"/>
               <w:rPr>
-                <w:rFonts w:ascii="Segoe UI" w:eastAsia="Times New Roman" w:hAnsi="Segoe UI" w:cs="Segoe UI"/>
-                <w:sz w:val="23"/>
-                <w:szCs w:val="23"/>
-                <w:lang w:bidi="si-LK"/>
+                <w:rFonts w:ascii="Segoe UI" w:hAnsi="Segoe UI" w:cs="Segoe UI"/>
+                <w:sz w:val="23"/>
+                <w:szCs w:val="23"/>
               </w:rPr>
             </w:pPr>
             <w:r>
               <w:rPr>
-                <w:rFonts w:ascii="Segoe UI" w:eastAsia="Times New Roman" w:hAnsi="Segoe UI" w:cs="Segoe UI"/>
-                <w:sz w:val="23"/>
-                <w:szCs w:val="23"/>
-                <w:lang w:bidi="si-LK"/>
-              </w:rPr>
-              <w:t>Rate of change critical</w:t>
+                <w:rFonts w:ascii="Segoe UI" w:hAnsi="Segoe UI" w:cs="Segoe UI"/>
+                <w:sz w:val="23"/>
+                <w:szCs w:val="23"/>
+              </w:rPr>
+              <w:t>Current DNS state important</w:t>
             </w:r>
           </w:p>
         </w:tc>
       </w:tr>
       <w:tr>
+        <w:trPr>
+          <w:trHeight w:val="170"/>
+        </w:trPr>
         <w:tc>
           <w:tcPr>
             <w:tcW w:w="0" w:type="auto"/>
@@ -6499,21 +6505,20 @@
             <w:pPr>
               <w:spacing w:after="0" w:line="375" w:lineRule="atLeast"/>
               <w:rPr>
-                <w:rFonts w:ascii="Segoe UI" w:eastAsia="Times New Roman" w:hAnsi="Segoe UI" w:cs="Segoe UI"/>
-                <w:sz w:val="23"/>
-                <w:szCs w:val="23"/>
-                <w:lang w:bidi="si-LK"/>
+                <w:rFonts w:ascii="Segoe UI" w:hAnsi="Segoe UI" w:cs="Segoe UI"/>
+                <w:sz w:val="23"/>
+                <w:szCs w:val="23"/>
               </w:rPr>
             </w:pPr>
             <w:proofErr w:type="spellStart"/>
             <w:r>
               <w:rPr>
-                <w:rFonts w:ascii="Segoe UI" w:eastAsia="Times New Roman" w:hAnsi="Segoe UI" w:cs="Segoe UI"/>
-                <w:sz w:val="23"/>
-                <w:szCs w:val="23"/>
-                <w:lang w:bidi="si-LK"/>
-              </w:rPr>
-              <w:t>avg_latency</w:t>
+                <w:rStyle w:val="Strong"/>
+                <w:rFonts w:ascii="Segoe UI" w:hAnsi="Segoe UI" w:cs="Segoe UI"/>
+                <w:sz w:val="23"/>
+                <w:szCs w:val="23"/>
+              </w:rPr>
+              <w:t>rssi_trend</w:t>
             </w:r>
             <w:proofErr w:type="spellEnd"/>
           </w:p>
@@ -6534,20 +6539,18 @@
             <w:pPr>
               <w:spacing w:after="0" w:line="375" w:lineRule="atLeast"/>
               <w:rPr>
-                <w:rFonts w:ascii="Segoe UI" w:eastAsia="Times New Roman" w:hAnsi="Segoe UI" w:cs="Segoe UI"/>
-                <w:sz w:val="23"/>
-                <w:szCs w:val="23"/>
-                <w:lang w:bidi="si-LK"/>
+                <w:rFonts w:ascii="Segoe UI" w:hAnsi="Segoe UI" w:cs="Segoe UI"/>
+                <w:sz w:val="23"/>
+                <w:szCs w:val="23"/>
               </w:rPr>
             </w:pPr>
             <w:r>
               <w:rPr>
-                <w:rFonts w:ascii="Segoe UI" w:eastAsia="Times New Roman" w:hAnsi="Segoe UI" w:cs="Segoe UI"/>
-                <w:sz w:val="23"/>
-                <w:szCs w:val="23"/>
-                <w:lang w:bidi="si-LK"/>
-              </w:rPr>
-              <w:t>9.5%</w:t>
+                <w:rFonts w:ascii="Segoe UI" w:hAnsi="Segoe UI" w:cs="Segoe UI"/>
+                <w:sz w:val="23"/>
+                <w:szCs w:val="23"/>
+              </w:rPr>
+              <w:t>15.3%</w:t>
             </w:r>
           </w:p>
         </w:tc>
@@ -6567,25 +6570,26 @@
             <w:pPr>
               <w:spacing w:after="0" w:line="375" w:lineRule="atLeast"/>
               <w:rPr>
-                <w:rFonts w:ascii="Segoe UI" w:eastAsia="Times New Roman" w:hAnsi="Segoe UI" w:cs="Segoe UI"/>
-                <w:sz w:val="23"/>
-                <w:szCs w:val="23"/>
-                <w:lang w:bidi="si-LK"/>
+                <w:rFonts w:ascii="Segoe UI" w:hAnsi="Segoe UI" w:cs="Segoe UI"/>
+                <w:sz w:val="23"/>
+                <w:szCs w:val="23"/>
               </w:rPr>
             </w:pPr>
             <w:r>
               <w:rPr>
-                <w:rFonts w:ascii="Segoe UI" w:eastAsia="Times New Roman" w:hAnsi="Segoe UI" w:cs="Segoe UI"/>
-                <w:sz w:val="23"/>
-                <w:szCs w:val="23"/>
-                <w:lang w:bidi="si-LK"/>
-              </w:rPr>
-              <w:t>Combined metric valuable</w:t>
+                <w:rFonts w:ascii="Segoe UI" w:hAnsi="Segoe UI" w:cs="Segoe UI"/>
+                <w:sz w:val="23"/>
+                <w:szCs w:val="23"/>
+              </w:rPr>
+              <w:t>Signal degradation key indicator</w:t>
             </w:r>
           </w:p>
         </w:tc>
       </w:tr>
       <w:tr>
+        <w:trPr>
+          <w:trHeight w:val="170"/>
+        </w:trPr>
         <w:tc>
           <w:tcPr>
             <w:tcW w:w="0" w:type="auto"/>
@@ -6602,21 +6606,119 @@
             <w:pPr>
               <w:spacing w:after="0" w:line="375" w:lineRule="atLeast"/>
               <w:rPr>
-                <w:rFonts w:ascii="Segoe UI" w:eastAsia="Times New Roman" w:hAnsi="Segoe UI" w:cs="Segoe UI"/>
-                <w:sz w:val="23"/>
-                <w:szCs w:val="23"/>
-                <w:lang w:bidi="si-LK"/>
+                <w:rFonts w:ascii="Segoe UI" w:hAnsi="Segoe UI" w:cs="Segoe UI"/>
+                <w:sz w:val="23"/>
+                <w:szCs w:val="23"/>
+              </w:rPr>
+            </w:pPr>
+            <w:r>
+              <w:rPr>
+                <w:rStyle w:val="Strong"/>
+                <w:rFonts w:ascii="Segoe UI" w:hAnsi="Segoe UI" w:cs="Segoe UI"/>
+                <w:sz w:val="23"/>
+                <w:szCs w:val="23"/>
+              </w:rPr>
+              <w:t>router_ping_rolling5</w:t>
+            </w:r>
+          </w:p>
+        </w:tc>
+        <w:tc>
+          <w:tcPr>
+            <w:tcW w:w="0" w:type="auto"/>
+            <w:tcMar>
+              <w:top w:w="150" w:type="dxa"/>
+              <w:left w:w="240" w:type="dxa"/>
+              <w:bottom w:w="150" w:type="dxa"/>
+              <w:right w:w="240" w:type="dxa"/>
+            </w:tcMar>
+            <w:vAlign w:val="center"/>
+            <w:hideMark/>
+          </w:tcPr>
+          <w:p>
+            <w:pPr>
+              <w:spacing w:after="0" w:line="375" w:lineRule="atLeast"/>
+              <w:rPr>
+                <w:rFonts w:ascii="Segoe UI" w:hAnsi="Segoe UI" w:cs="Segoe UI"/>
+                <w:sz w:val="23"/>
+                <w:szCs w:val="23"/>
+              </w:rPr>
+            </w:pPr>
+            <w:r>
+              <w:rPr>
+                <w:rFonts w:ascii="Segoe UI" w:hAnsi="Segoe UI" w:cs="Segoe UI"/>
+                <w:sz w:val="23"/>
+                <w:szCs w:val="23"/>
+              </w:rPr>
+              <w:t>8.4%</w:t>
+            </w:r>
+          </w:p>
+        </w:tc>
+        <w:tc>
+          <w:tcPr>
+            <w:tcW w:w="0" w:type="auto"/>
+            <w:tcMar>
+              <w:top w:w="150" w:type="dxa"/>
+              <w:left w:w="240" w:type="dxa"/>
+              <w:bottom w:w="150" w:type="dxa"/>
+              <w:right w:w="0" w:type="dxa"/>
+            </w:tcMar>
+            <w:vAlign w:val="center"/>
+            <w:hideMark/>
+          </w:tcPr>
+          <w:p>
+            <w:pPr>
+              <w:spacing w:after="0" w:line="375" w:lineRule="atLeast"/>
+              <w:rPr>
+                <w:rFonts w:ascii="Segoe UI" w:hAnsi="Segoe UI" w:cs="Segoe UI"/>
+                <w:sz w:val="23"/>
+                <w:szCs w:val="23"/>
+              </w:rPr>
+            </w:pPr>
+            <w:r>
+              <w:rPr>
+                <w:rFonts w:ascii="Segoe UI" w:hAnsi="Segoe UI" w:cs="Segoe UI"/>
+                <w:sz w:val="23"/>
+                <w:szCs w:val="23"/>
+              </w:rPr>
+              <w:t>Local network less predictive</w:t>
+            </w:r>
+          </w:p>
+        </w:tc>
+      </w:tr>
+      <w:tr>
+        <w:trPr>
+          <w:trHeight w:val="170"/>
+        </w:trPr>
+        <w:tc>
+          <w:tcPr>
+            <w:tcW w:w="0" w:type="auto"/>
+            <w:tcMar>
+              <w:top w:w="150" w:type="dxa"/>
+              <w:left w:w="0" w:type="dxa"/>
+              <w:bottom w:w="150" w:type="dxa"/>
+              <w:right w:w="240" w:type="dxa"/>
+            </w:tcMar>
+            <w:vAlign w:val="center"/>
+            <w:hideMark/>
+          </w:tcPr>
+          <w:p>
+            <w:pPr>
+              <w:spacing w:after="0" w:line="375" w:lineRule="atLeast"/>
+              <w:rPr>
+                <w:rFonts w:ascii="Segoe UI" w:hAnsi="Segoe UI" w:cs="Segoe UI"/>
+                <w:sz w:val="23"/>
+                <w:szCs w:val="23"/>
               </w:rPr>
             </w:pPr>
             <w:proofErr w:type="spellStart"/>
             <w:r>
               <w:rPr>
-                <w:rFonts w:ascii="Segoe UI" w:eastAsia="Times New Roman" w:hAnsi="Segoe UI" w:cs="Segoe UI"/>
-                <w:sz w:val="23"/>
-                <w:szCs w:val="23"/>
-                <w:lang w:bidi="si-LK"/>
-              </w:rPr>
-              <w:t>dns_latency_ms</w:t>
+                <w:rStyle w:val="Strong"/>
+                <w:rFonts w:ascii="Segoe UI" w:hAnsi="Segoe UI" w:cs="Segoe UI"/>
+                <w:sz w:val="23"/>
+                <w:szCs w:val="23"/>
+              </w:rPr>
+              <w:t>rssi_dbm</w:t>
             </w:r>
             <w:proofErr w:type="spellEnd"/>
           </w:p>
@@ -6637,20 +6739,18 @@
             <w:pPr>
               <w:spacing w:after="0" w:line="375" w:lineRule="atLeast"/>
               <w:rPr>
-                <w:rFonts w:ascii="Segoe UI" w:eastAsia="Times New Roman" w:hAnsi="Segoe UI" w:cs="Segoe UI"/>
-                <w:sz w:val="23"/>
-                <w:szCs w:val="23"/>
-                <w:lang w:bidi="si-LK"/>
+                <w:rFonts w:ascii="Segoe UI" w:hAnsi="Segoe UI" w:cs="Segoe UI"/>
+                <w:sz w:val="23"/>
+                <w:szCs w:val="23"/>
               </w:rPr>
             </w:pPr>
             <w:r>
               <w:rPr>
-                <w:rFonts w:ascii="Segoe UI" w:eastAsia="Times New Roman" w:hAnsi="Segoe UI" w:cs="Segoe UI"/>
-                <w:sz w:val="23"/>
-                <w:szCs w:val="23"/>
-                <w:lang w:bidi="si-LK"/>
-              </w:rPr>
-              <w:t>9.1%</w:t>
+                <w:rFonts w:ascii="Segoe UI" w:hAnsi="Segoe UI" w:cs="Segoe UI"/>
+                <w:sz w:val="23"/>
+                <w:szCs w:val="23"/>
+              </w:rPr>
+              <w:t>3.0%</w:t>
             </w:r>
           </w:p>
         </w:tc>
@@ -6670,121 +6770,18 @@
             <w:pPr>
               <w:spacing w:after="0" w:line="375" w:lineRule="atLeast"/>
               <w:rPr>
-                <w:rFonts w:ascii="Segoe UI" w:eastAsia="Times New Roman" w:hAnsi="Segoe UI" w:cs="Segoe UI"/>
-                <w:sz w:val="23"/>
-                <w:szCs w:val="23"/>
-                <w:lang w:bidi="si-LK"/>
+                <w:rFonts w:ascii="Segoe UI" w:hAnsi="Segoe UI" w:cs="Segoe UI"/>
+                <w:sz w:val="23"/>
+                <w:szCs w:val="23"/>
               </w:rPr>
             </w:pPr>
             <w:r>
               <w:rPr>
-                <w:rFonts w:ascii="Segoe UI" w:eastAsia="Times New Roman" w:hAnsi="Segoe UI" w:cs="Segoe UI"/>
-                <w:sz w:val="23"/>
-                <w:szCs w:val="23"/>
-                <w:lang w:bidi="si-LK"/>
-              </w:rPr>
-              <w:t>Current state less important</w:t>
-            </w:r>
-          </w:p>
-        </w:tc>
-      </w:tr>
-      <w:tr>
-        <w:tc>
-          <w:tcPr>
-            <w:tcW w:w="0" w:type="auto"/>
-            <w:tcMar>
-              <w:top w:w="150" w:type="dxa"/>
-              <w:left w:w="0" w:type="dxa"/>
-              <w:bottom w:w="150" w:type="dxa"/>
-              <w:right w:w="240" w:type="dxa"/>
-            </w:tcMar>
-            <w:vAlign w:val="center"/>
-            <w:hideMark/>
-          </w:tcPr>
-          <w:p>
-            <w:pPr>
-              <w:spacing w:after="0" w:line="375" w:lineRule="atLeast"/>
-              <w:rPr>
-                <w:rFonts w:ascii="Segoe UI" w:eastAsia="Times New Roman" w:hAnsi="Segoe UI" w:cs="Segoe UI"/>
-                <w:sz w:val="23"/>
-                <w:szCs w:val="23"/>
-                <w:lang w:bidi="si-LK"/>
-              </w:rPr>
-            </w:pPr>
-            <w:r>
-              <w:rPr>
-                <w:rFonts w:ascii="Segoe UI" w:eastAsia="Times New Roman" w:hAnsi="Segoe UI" w:cs="Segoe UI"/>
-                <w:sz w:val="23"/>
-                <w:szCs w:val="23"/>
-                <w:lang w:bidi="si-LK"/>
-              </w:rPr>
-              <w:t>router_latency_ms_rolling5</w:t>
-            </w:r>
-          </w:p>
-        </w:tc>
-        <w:tc>
-          <w:tcPr>
-            <w:tcW w:w="0" w:type="auto"/>
-            <w:tcMar>
-              <w:top w:w="150" w:type="dxa"/>
-              <w:left w:w="240" w:type="dxa"/>
-              <w:bottom w:w="150" w:type="dxa"/>
-              <w:right w:w="240" w:type="dxa"/>
-            </w:tcMar>
-            <w:vAlign w:val="center"/>
-            <w:hideMark/>
-          </w:tcPr>
-          <w:p>
-            <w:pPr>
-              <w:spacing w:after="0" w:line="375" w:lineRule="atLeast"/>
-              <w:rPr>
-                <w:rFonts w:ascii="Segoe UI" w:eastAsia="Times New Roman" w:hAnsi="Segoe UI" w:cs="Segoe UI"/>
-                <w:sz w:val="23"/>
-                <w:szCs w:val="23"/>
-                <w:lang w:bidi="si-LK"/>
-              </w:rPr>
-            </w:pPr>
-            <w:r>
-              <w:rPr>
-                <w:rFonts w:ascii="Segoe UI" w:eastAsia="Times New Roman" w:hAnsi="Segoe UI" w:cs="Segoe UI"/>
-                <w:sz w:val="23"/>
-                <w:szCs w:val="23"/>
-                <w:lang w:bidi="si-LK"/>
-              </w:rPr>
-              <w:t>6.6%</w:t>
-            </w:r>
-          </w:p>
-        </w:tc>
-        <w:tc>
-          <w:tcPr>
-            <w:tcW w:w="0" w:type="auto"/>
-            <w:tcMar>
-              <w:top w:w="150" w:type="dxa"/>
-              <w:left w:w="240" w:type="dxa"/>
-              <w:bottom w:w="150" w:type="dxa"/>
-              <w:right w:w="0" w:type="dxa"/>
-            </w:tcMar>
-            <w:vAlign w:val="center"/>
-            <w:hideMark/>
-          </w:tcPr>
-          <w:p>
-            <w:pPr>
-              <w:spacing w:after="0" w:line="375" w:lineRule="atLeast"/>
-              <w:rPr>
-                <w:rFonts w:ascii="Segoe UI" w:eastAsia="Times New Roman" w:hAnsi="Segoe UI" w:cs="Segoe UI"/>
-                <w:sz w:val="23"/>
-                <w:szCs w:val="23"/>
-                <w:lang w:bidi="si-LK"/>
-              </w:rPr>
-            </w:pPr>
-            <w:r>
-              <w:rPr>
-                <w:rFonts w:ascii="Segoe UI" w:eastAsia="Times New Roman" w:hAnsi="Segoe UI" w:cs="Segoe UI"/>
-                <w:sz w:val="23"/>
-                <w:szCs w:val="23"/>
-                <w:lang w:bidi="si-LK"/>
-              </w:rPr>
-              <w:t>Local network stable</w:t>
+                <w:rFonts w:ascii="Segoe UI" w:hAnsi="Segoe UI" w:cs="Segoe UI"/>
+                <w:sz w:val="23"/>
+                <w:szCs w:val="23"/>
+              </w:rPr>
+              <w:t>Instant RSSI less important than trend</w:t>
             </w:r>
           </w:p>
         </w:tc>
@@ -6822,7 +6819,29 @@
           <w:szCs w:val="24"/>
           <w:lang w:bidi="si-LK"/>
         </w:rPr>
-        <w:t>: DNS metrics dominate because router latency was consistently 2-8ms (too stable to predict failures).</w:t>
+        <w:t xml:space="preserve">: DNS metrics dominate because router latency was consistently 2-8ms (too </w:t>
+      </w:r>
+      <w:proofErr w:type="gramStart"/>
+      <w:r>
+        <w:rPr>
+          <w:rFonts w:ascii="Segoe UI" w:eastAsia="Times New Roman" w:hAnsi="Segoe UI" w:cs="Segoe UI"/>
+          <w:color w:val="0F1115"/>
+          <w:sz w:val="24"/>
+          <w:szCs w:val="24"/>
+          <w:lang w:bidi="si-LK"/>
+        </w:rPr>
+        <w:t>stable</w:t>
+      </w:r>
+      <w:proofErr w:type="gramEnd"/>
+      <w:r>
+        <w:rPr>
+          <w:rFonts w:ascii="Segoe UI" w:eastAsia="Times New Roman" w:hAnsi="Segoe UI" w:cs="Segoe UI"/>
+          <w:color w:val="0F1115"/>
+          <w:sz w:val="24"/>
+          <w:szCs w:val="24"/>
+          <w:lang w:bidi="si-LK"/>
+        </w:rPr>
+        <w:t xml:space="preserve"> to predict failures).</w:t>
       </w:r>
     </w:p>
     <w:p>
@@ -6904,6 +6923,24 @@
     <w:p>
       <w:pPr>
         <w:shd w:val="clear" w:color="auto" w:fill="FFFFFF"/>
+        <w:spacing w:before="480" w:after="240" w:line="480" w:lineRule="atLeast"/>
+        <w:outlineLvl w:val="1"/>
+        <w:rPr>
+          <w:rFonts w:ascii="Segoe UI" w:eastAsia="Times New Roman" w:hAnsi="Segoe UI" w:cs="Segoe UI"/>
+          <w:b/>
+          <w:bCs/>
+          <w:color w:val="0F1115"/>
+          <w:sz w:val="33"/>
+          <w:szCs w:val="33"/>
+          <w:lang w:bidi="si-LK"/>
+        </w:rPr>
+      </w:pPr>
+      <w:bookmarkStart w:id="0" w:name="_GoBack"/>
+      <w:bookmarkEnd w:id="0"/>
+    </w:p>
+    <w:p>
+      <w:pPr>
+        <w:shd w:val="clear" w:color="auto" w:fill="FFFFFF"/>
         <w:spacing w:before="480" w:after="240" w:line="450" w:lineRule="atLeast"/>
         <w:outlineLvl w:val="2"/>
         <w:rPr>
@@ -7045,6 +7082,32 @@
         </w:rPr>
         <w:t>ing - Optimized implementation of gradient boosted trees</w:t>
       </w:r>
+    </w:p>
+    <w:p>
+      <w:pPr>
+        <w:shd w:val="clear" w:color="auto" w:fill="FFFFFF"/>
+        <w:spacing w:before="240" w:after="240" w:line="240" w:lineRule="auto"/>
+        <w:rPr>
+          <w:rFonts w:ascii="Segoe UI" w:eastAsia="Times New Roman" w:hAnsi="Segoe UI" w:cs="Segoe UI"/>
+          <w:color w:val="0F1115"/>
+          <w:sz w:val="24"/>
+          <w:szCs w:val="24"/>
+          <w:lang w:bidi="si-LK"/>
+        </w:rPr>
+      </w:pPr>
+    </w:p>
+    <w:p>
+      <w:pPr>
+        <w:shd w:val="clear" w:color="auto" w:fill="FFFFFF"/>
+        <w:spacing w:before="240" w:after="240" w:line="240" w:lineRule="auto"/>
+        <w:rPr>
+          <w:rFonts w:ascii="Segoe UI" w:eastAsia="Times New Roman" w:hAnsi="Segoe UI" w:cs="Segoe UI"/>
+          <w:color w:val="0F1115"/>
+          <w:sz w:val="24"/>
+          <w:szCs w:val="24"/>
+          <w:lang w:bidi="si-LK"/>
+        </w:rPr>
+      </w:pPr>
     </w:p>
     <w:p>
       <w:pPr>
@@ -7127,7 +7190,6 @@
           <w:szCs w:val="24"/>
           <w:lang w:bidi="si-LK"/>
         </w:rPr>
-        <w:lastRenderedPageBreak/>
         <w:t>Each tree: Max depth 4 (16 leaves maximum)</w:t>
       </w:r>
     </w:p>
@@ -8364,6 +8426,7 @@
                 <w:shd w:val="clear" w:color="auto" w:fill="EBEEF2"/>
                 <w:lang w:bidi="si-LK"/>
               </w:rPr>
+              <w:lastRenderedPageBreak/>
               <w:t>max_depth</w:t>
             </w:r>
             <w:proofErr w:type="spellEnd"/>
@@ -8794,7 +8857,6 @@
           <w:szCs w:val="30"/>
           <w:lang w:bidi="si-LK"/>
         </w:rPr>
-        <w:lastRenderedPageBreak/>
         <w:t xml:space="preserve">Why </w:t>
       </w:r>
       <w:proofErr w:type="spellStart"/>
@@ -9684,6 +9746,7 @@
           <w:szCs w:val="30"/>
           <w:lang w:bidi="si-LK"/>
         </w:rPr>
+        <w:lastRenderedPageBreak/>
         <w:t>Training Process</w:t>
       </w:r>
     </w:p>
@@ -10366,7 +10429,6 @@
           <w:szCs w:val="30"/>
           <w:lang w:bidi="si-LK"/>
         </w:rPr>
-        <w:lastRenderedPageBreak/>
         <w:t>What Happens During Training</w:t>
       </w:r>
     </w:p>
@@ -10859,6 +10921,7 @@
           <w:szCs w:val="30"/>
           <w:lang w:bidi="si-LK"/>
         </w:rPr>
+        <w:lastRenderedPageBreak/>
         <w:t>Real-time Prediction Pipeline</w:t>
       </w:r>
     </w:p>
@@ -11684,7 +11747,6 @@
           <w:szCs w:val="20"/>
           <w:lang w:bidi="si-LK"/>
         </w:rPr>
-        <w:lastRenderedPageBreak/>
         <w:t xml:space="preserve">    </w:t>
       </w:r>
       <w:proofErr w:type="gramStart"/>
@@ -13071,6 +13133,7 @@
                 <w:szCs w:val="23"/>
                 <w:lang w:bidi="si-LK"/>
               </w:rPr>
+              <w:lastRenderedPageBreak/>
               <w:t>DEGRADING</w:t>
             </w:r>
           </w:p>
@@ -13449,7 +13512,6 @@
           <w:szCs w:val="24"/>
           <w:lang w:bidi="si-LK"/>
         </w:rPr>
-        <w:lastRenderedPageBreak/>
         <w:pict>
           <v:rect id="_x0000_i1033" style="width:0;height:.75pt" o:hralign="center" o:hrstd="t" o:hr="t" fillcolor="#a0a0a0" stroked="f"/>
         </w:pict>
@@ -14099,6 +14161,7 @@
           <w:szCs w:val="30"/>
           <w:lang w:bidi="si-LK"/>
         </w:rPr>
+        <w:lastRenderedPageBreak/>
         <w:t>Critical Detection Definition</w:t>
       </w:r>
     </w:p>
@@ -14490,7 +14553,6 @@
           <w:szCs w:val="30"/>
           <w:lang w:bidi="si-LK"/>
         </w:rPr>
-        <w:lastRenderedPageBreak/>
         <w:t>Feature Importance Reliability</w:t>
       </w:r>
     </w:p>
@@ -15021,6 +15083,7 @@
           <w:szCs w:val="20"/>
           <w:lang w:bidi="si-LK"/>
         </w:rPr>
+        <w:lastRenderedPageBreak/>
         <w:t xml:space="preserve">            LEAF = 4.1 minutes</w:t>
       </w:r>
     </w:p>
@@ -15522,7 +15585,6 @@
           <w:szCs w:val="20"/>
           <w:lang w:bidi="si-LK"/>
         </w:rPr>
-        <w:lastRenderedPageBreak/>
         <w:t>...</w:t>
       </w:r>
     </w:p>
@@ -16160,6 +16222,7 @@
           <w:szCs w:val="20"/>
           <w:lang w:bidi="si-LK"/>
         </w:rPr>
+        <w:lastRenderedPageBreak/>
         <w:t>RULE 2 (Degrading):</w:t>
       </w:r>
     </w:p>
@@ -16648,7 +16711,6 @@
           <w:szCs w:val="24"/>
           <w:lang w:bidi="si-LK"/>
         </w:rPr>
-        <w:lastRenderedPageBreak/>
         <w:t>Trust</w:t>
       </w:r>
       <w:r>
@@ -17388,6 +17450,7 @@
                 <w:szCs w:val="23"/>
                 <w:lang w:bidi="si-LK"/>
               </w:rPr>
+              <w:lastRenderedPageBreak/>
               <w:t>scikit</w:t>
             </w:r>
             <w:proofErr w:type="spellEnd"/>
@@ -17934,7 +17997,6 @@
           <w:szCs w:val="30"/>
           <w:lang w:bidi="si-LK"/>
         </w:rPr>
-        <w:lastRenderedPageBreak/>
         <w:t>Development Environment</w:t>
       </w:r>
     </w:p>
@@ -18484,6 +18546,7 @@
                 <w:szCs w:val="23"/>
                 <w:lang w:bidi="si-LK"/>
               </w:rPr>
+              <w:lastRenderedPageBreak/>
               <w:t>Interpretability</w:t>
             </w:r>
           </w:p>
@@ -19408,7 +19471,6 @@
                 <w:szCs w:val="23"/>
                 <w:lang w:bidi="si-LK"/>
               </w:rPr>
-              <w:lastRenderedPageBreak/>
               <w:t>Approach</w:t>
             </w:r>
           </w:p>
@@ -20115,6 +20177,7 @@
                 <w:szCs w:val="23"/>
                 <w:lang w:bidi="si-LK"/>
               </w:rPr>
+              <w:lastRenderedPageBreak/>
               <w:t>2-second</w:t>
             </w:r>
           </w:p>
@@ -21035,7 +21098,6 @@
                 <w:szCs w:val="23"/>
                 <w:lang w:bidi="si-LK"/>
               </w:rPr>
-              <w:lastRenderedPageBreak/>
               <w:t>Linux/Mac RSSI</w:t>
             </w:r>
           </w:p>
@@ -21327,6 +21389,7 @@
           <w:szCs w:val="24"/>
           <w:lang w:bidi="si-LK"/>
         </w:rPr>
+        <w:lastRenderedPageBreak/>
         <w:t>Answer</w:t>
       </w:r>
       <w:r>
@@ -21834,7 +21897,6 @@
           <w:szCs w:val="24"/>
           <w:lang w:bidi="si-LK"/>
         </w:rPr>
-        <w:lastRenderedPageBreak/>
         <w:t>Answer</w:t>
       </w:r>
       <w:r>
@@ -22139,6 +22201,7 @@
           <w:szCs w:val="24"/>
           <w:lang w:bidi="si-LK"/>
         </w:rPr>
+        <w:lastRenderedPageBreak/>
         <w:t>Answer</w:t>
       </w:r>
       <w:r>
@@ -22376,7 +22439,6 @@
           <w:szCs w:val="24"/>
           <w:lang w:bidi="si-LK"/>
         </w:rPr>
-        <w:lastRenderedPageBreak/>
         <w:t>Answer</w:t>
       </w:r>
       <w:r>
@@ -22612,6 +22674,7 @@
           <w:szCs w:val="33"/>
           <w:lang w:bidi="si-LK"/>
         </w:rPr>
+        <w:lastRenderedPageBreak/>
         <w:t>13. CODE REFERENCES (Key Snippets)</w:t>
       </w:r>
     </w:p>
@@ -24270,7 +24333,6 @@
           <w:szCs w:val="18"/>
           <w:lang w:bidi="si-LK"/>
         </w:rPr>
-        <w:lastRenderedPageBreak/>
         <w:t>python</w:t>
       </w:r>
       <w:proofErr w:type="gramEnd"/>
@@ -25413,6 +25475,7 @@
           <w:szCs w:val="20"/>
           <w:lang w:bidi="si-LK"/>
         </w:rPr>
+        <w:lastRenderedPageBreak/>
         <w:t xml:space="preserve">    </w:t>
       </w:r>
       <w:proofErr w:type="gramStart"/>
@@ -26254,7 +26317,6 @@
                 <w:szCs w:val="23"/>
                 <w:lang w:bidi="si-LK"/>
               </w:rPr>
-              <w:lastRenderedPageBreak/>
               <w:t>Leaf Value</w:t>
             </w:r>
           </w:p>
@@ -26731,6 +26793,7 @@
           <w:szCs w:val="24"/>
           <w:lang w:bidi="si-LK"/>
         </w:rPr>
+        <w:lastRenderedPageBreak/>
         <w:pict>
           <v:rect id="_x0000_i1040" style="width:0;height:.75pt" o:hralign="center" o:hrstd="t" o:hr="t" fillcolor="#a0a0a0" stroked="f"/>
         </w:pict>
@@ -27249,7 +27312,6 @@
           <w:szCs w:val="24"/>
           <w:lang w:bidi="si-LK"/>
         </w:rPr>
-        <w:lastRenderedPageBreak/>
         <w:pict>
           <v:rect id="_x0000_i1041" style="width:0;height:.75pt" o:hralign="center" o:hrstd="t" o:hr="t" fillcolor="#a0a0a0" stroked="f"/>
         </w:pict>
@@ -27701,6 +27763,7 @@
           <w:szCs w:val="24"/>
           <w:lang w:bidi="si-LK"/>
         </w:rPr>
+        <w:lastRenderedPageBreak/>
         <w:t>Created</w:t>
       </w:r>
       <w:r>

</xml_diff>